<commit_message>
20260808: Wire Courses tab-support and outcome-matrix read/delete into engine block, refine report-card document category projection and ratings/tree rendering
</commit_message>
<xml_diff>
--- a/domain/operation/outcome_summary/document/outcome-summary-template-block.docx
+++ b/domain/operation/outcome_summary/document/outcome-summary-template-block.docx
@@ -411,7 +411,7 @@
                 <w:sz w:val="16"/>
                 <w:szCs w:val="16"/>
               </w:rPr>
-              <w:t xml:space="preserve">Semester 1</w:t>
+              <w:t xml:space="preserve">Term 1</w:t>
             </w:r>
           </w:p>
         </w:tc>
@@ -434,7 +434,7 @@
                 <w:sz w:val="16"/>
                 <w:szCs w:val="16"/>
               </w:rPr>
-              <w:t xml:space="preserve">Semester 2</w:t>
+              <w:t xml:space="preserve">Term 2</w:t>
             </w:r>
           </w:p>
         </w:tc>
@@ -683,7 +683,7 @@
                 <w:sz w:val="16"/>
                 <w:szCs w:val="16"/>
               </w:rPr>
-              <w:t xml:space="preserve">Semestral Progress</w:t>
+              <w:t xml:space="preserve">Term Progress</w:t>
             </w:r>
           </w:p>
         </w:tc>
@@ -1494,7 +1494,7 @@
                 <w:sz w:val="18"/>
                 <w:szCs w:val="18"/>
               </w:rPr>
-              <w:t xml:space="preserve">1st Semester</w:t>
+              <w:t xml:space="preserve">Term 1</w:t>
             </w:r>
           </w:p>
         </w:tc>
@@ -1521,7 +1521,7 @@
                 <w:sz w:val="18"/>
                 <w:szCs w:val="18"/>
               </w:rPr>
-              <w:t xml:space="preserve">2nd Semester</w:t>
+              <w:t xml:space="preserve">Term 2</w:t>
             </w:r>
           </w:p>
         </w:tc>
@@ -1727,7 +1727,7 @@
                 <w:sz w:val="18"/>
                 <w:szCs w:val="18"/>
               </w:rPr>
-              <w:t xml:space="preserve">1st Semester</w:t>
+              <w:t xml:space="preserve">Term 1</w:t>
             </w:r>
           </w:p>
         </w:tc>
@@ -1754,7 +1754,7 @@
                 <w:sz w:val="18"/>
                 <w:szCs w:val="18"/>
               </w:rPr>
-              <w:t xml:space="preserve">2nd Semester</w:t>
+              <w:t xml:space="preserve">Term 2</w:t>
             </w:r>
           </w:p>
         </w:tc>
@@ -2298,276 +2298,85 @@
         </w:tc>
         <w:tc>
           <w:tcPr>
-            <w:tcW w:w="689" w:type="dxa"/>
-            <w:tcBorders>
-              <w:top w:val="nil"/>
-              <w:left w:val="nil"/>
-              <w:bottom w:val="single" w:sz="5" w:space="0" w:color="C00000"/>
-              <w:right w:val="nil"/>
-            </w:tcBorders>
-            <w:vAlign w:val="center"/>
-          </w:tcPr>
-          <w:p>
-            <w:pPr>
-              <w:spacing w:after="0"/>
-              <w:jc w:val="center"/>
-            </w:pPr>
-            <w:r>
-              <w:rPr>
-                <w:sz w:val="14"/>
-                <w:szCs w:val="14"/>
-              </w:rPr>
-              <w:t xml:space="preserve">July</w:t>
-            </w:r>
-          </w:p>
-        </w:tc>
-        <w:tc>
-          <w:tcPr>
-            <w:tcW w:w="689" w:type="dxa"/>
-            <w:tcBorders>
-              <w:top w:val="nil"/>
-              <w:left w:val="nil"/>
-              <w:bottom w:val="single" w:sz="5" w:space="0" w:color="C00000"/>
-              <w:right w:val="nil"/>
-            </w:tcBorders>
-            <w:vAlign w:val="center"/>
-          </w:tcPr>
-          <w:p>
-            <w:pPr>
-              <w:spacing w:after="0"/>
-              <w:jc w:val="center"/>
-            </w:pPr>
-            <w:r>
-              <w:rPr>
-                <w:sz w:val="14"/>
-                <w:szCs w:val="14"/>
-              </w:rPr>
-              <w:t xml:space="preserve">August</w:t>
-            </w:r>
-          </w:p>
-        </w:tc>
-        <w:tc>
-          <w:tcPr>
-            <w:tcW w:w="779" w:type="dxa"/>
-            <w:tcBorders>
-              <w:top w:val="nil"/>
-              <w:left w:val="nil"/>
-              <w:bottom w:val="single" w:sz="5" w:space="0" w:color="C00000"/>
-              <w:right w:val="nil"/>
-            </w:tcBorders>
-            <w:vAlign w:val="center"/>
-          </w:tcPr>
-          <w:p>
-            <w:pPr>
-              <w:spacing w:after="0"/>
-              <w:jc w:val="center"/>
-            </w:pPr>
-            <w:r>
-              <w:rPr>
-                <w:sz w:val="14"/>
-                <w:szCs w:val="14"/>
-              </w:rPr>
-              <w:t xml:space="preserve">September</w:t>
-            </w:r>
-          </w:p>
-        </w:tc>
-        <w:tc>
-          <w:tcPr>
-            <w:tcW w:w="689" w:type="dxa"/>
-            <w:tcBorders>
-              <w:top w:val="nil"/>
-              <w:left w:val="nil"/>
-              <w:bottom w:val="single" w:sz="5" w:space="0" w:color="C00000"/>
-              <w:right w:val="nil"/>
-            </w:tcBorders>
-            <w:vAlign w:val="center"/>
-          </w:tcPr>
-          <w:p>
-            <w:pPr>
-              <w:spacing w:after="0"/>
-              <w:jc w:val="center"/>
-            </w:pPr>
-            <w:r>
-              <w:rPr>
-                <w:sz w:val="14"/>
-                <w:szCs w:val="14"/>
-              </w:rPr>
-              <w:t xml:space="preserve">October</w:t>
-            </w:r>
-          </w:p>
-        </w:tc>
-        <w:tc>
-          <w:tcPr>
-            <w:tcW w:w="689" w:type="dxa"/>
-            <w:tcBorders>
-              <w:top w:val="nil"/>
-              <w:left w:val="nil"/>
-              <w:bottom w:val="single" w:sz="5" w:space="0" w:color="C00000"/>
-              <w:right w:val="nil"/>
-            </w:tcBorders>
-            <w:vAlign w:val="center"/>
-          </w:tcPr>
-          <w:p>
-            <w:pPr>
-              <w:spacing w:after="0"/>
-              <w:jc w:val="center"/>
-            </w:pPr>
-            <w:r>
-              <w:rPr>
-                <w:sz w:val="14"/>
-                <w:szCs w:val="14"/>
-              </w:rPr>
-              <w:t xml:space="preserve">November</w:t>
-            </w:r>
-          </w:p>
-        </w:tc>
-        <w:tc>
-          <w:tcPr>
-            <w:tcW w:w="689" w:type="dxa"/>
-            <w:tcBorders>
-              <w:top w:val="nil"/>
-              <w:left w:val="nil"/>
-              <w:bottom w:val="single" w:sz="5" w:space="0" w:color="C00000"/>
-              <w:right w:val="nil"/>
-            </w:tcBorders>
-            <w:vAlign w:val="center"/>
-          </w:tcPr>
-          <w:p>
-            <w:pPr>
-              <w:spacing w:after="0"/>
-              <w:jc w:val="center"/>
-            </w:pPr>
-            <w:r>
-              <w:rPr>
-                <w:sz w:val="14"/>
-                <w:szCs w:val="14"/>
-              </w:rPr>
-              <w:t xml:space="preserve">December</w:t>
-            </w:r>
-          </w:p>
-        </w:tc>
-        <w:tc>
-          <w:tcPr>
-            <w:tcW w:w="689" w:type="dxa"/>
-            <w:tcBorders>
-              <w:top w:val="nil"/>
-              <w:left w:val="nil"/>
-              <w:bottom w:val="single" w:sz="5" w:space="0" w:color="C00000"/>
-              <w:right w:val="nil"/>
-            </w:tcBorders>
-            <w:vAlign w:val="center"/>
-          </w:tcPr>
-          <w:p>
-            <w:pPr>
-              <w:spacing w:after="0"/>
-              <w:jc w:val="center"/>
-            </w:pPr>
-            <w:r>
-              <w:rPr>
-                <w:sz w:val="14"/>
-                <w:szCs w:val="14"/>
-              </w:rPr>
-              <w:t xml:space="preserve">January</w:t>
-            </w:r>
-          </w:p>
-        </w:tc>
-        <w:tc>
-          <w:tcPr>
-            <w:tcW w:w="689" w:type="dxa"/>
-            <w:tcBorders>
-              <w:top w:val="nil"/>
-              <w:left w:val="nil"/>
-              <w:bottom w:val="single" w:sz="5" w:space="0" w:color="C00000"/>
-              <w:right w:val="nil"/>
-            </w:tcBorders>
-            <w:vAlign w:val="center"/>
-          </w:tcPr>
-          <w:p>
-            <w:pPr>
-              <w:spacing w:after="0"/>
-              <w:jc w:val="center"/>
-            </w:pPr>
-            <w:r>
-              <w:rPr>
-                <w:sz w:val="14"/>
-                <w:szCs w:val="14"/>
-              </w:rPr>
-              <w:t xml:space="preserve">February</w:t>
-            </w:r>
-          </w:p>
-        </w:tc>
-        <w:tc>
-          <w:tcPr>
-            <w:tcW w:w="689" w:type="dxa"/>
-            <w:tcBorders>
-              <w:top w:val="nil"/>
-              <w:left w:val="nil"/>
-              <w:bottom w:val="single" w:sz="5" w:space="0" w:color="C00000"/>
-              <w:right w:val="nil"/>
-            </w:tcBorders>
-            <w:vAlign w:val="center"/>
-          </w:tcPr>
-          <w:p>
-            <w:pPr>
-              <w:spacing w:after="0"/>
-              <w:jc w:val="center"/>
-            </w:pPr>
-            <w:r>
-              <w:rPr>
-                <w:sz w:val="14"/>
-                <w:szCs w:val="14"/>
-              </w:rPr>
-              <w:t xml:space="preserve">March</w:t>
-            </w:r>
-          </w:p>
-        </w:tc>
-        <w:tc>
-          <w:tcPr>
-            <w:tcW w:w="689" w:type="dxa"/>
-            <w:tcBorders>
-              <w:top w:val="nil"/>
-              <w:left w:val="nil"/>
-              <w:bottom w:val="single" w:sz="5" w:space="0" w:color="C00000"/>
-              <w:right w:val="nil"/>
-            </w:tcBorders>
-            <w:vAlign w:val="center"/>
-          </w:tcPr>
-          <w:p>
-            <w:pPr>
-              <w:spacing w:after="0"/>
-              <w:jc w:val="center"/>
-            </w:pPr>
-            <w:r>
-              <w:rPr>
-                <w:sz w:val="14"/>
-                <w:szCs w:val="14"/>
-              </w:rPr>
-              <w:t xml:space="preserve">April</w:t>
-            </w:r>
-          </w:p>
-        </w:tc>
-        <w:tc>
-          <w:tcPr>
-            <w:tcW w:w="689" w:type="dxa"/>
-            <w:tcBorders>
-              <w:top w:val="nil"/>
-              <w:left w:val="nil"/>
-              <w:bottom w:val="single" w:sz="5" w:space="0" w:color="C00000"/>
-              <w:right w:val="nil"/>
-            </w:tcBorders>
-            <w:vAlign w:val="center"/>
-          </w:tcPr>
-          <w:p>
-            <w:pPr>
-              <w:spacing w:after="0"/>
-              <w:jc w:val="center"/>
-            </w:pPr>
-            <w:r>
-              <w:rPr>
-                <w:sz w:val="14"/>
-                <w:szCs w:val="14"/>
-              </w:rPr>
-              <w:t xml:space="preserve">May</w:t>
+            <w:tcW w:w="2846" w:type="dxa"/>
+            <w:gridSpan w:val="4"/>
+            <w:tcBorders>
+              <w:top w:val="nil"/>
+              <w:left w:val="nil"/>
+              <w:bottom w:val="single" w:sz="5" w:space="0" w:color="C00000"/>
+              <w:right w:val="nil"/>
+            </w:tcBorders>
+            <w:vAlign w:val="center"/>
+          </w:tcPr>
+          <w:p>
+            <w:pPr>
+              <w:spacing w:after="0"/>
+              <w:jc w:val="center"/>
+            </w:pPr>
+            <w:r>
+              <w:rPr>
+                <w:b/>
+                <w:color w:val="C00000"/>
+                <w:sz w:val="14"/>
+                <w:szCs w:val="14"/>
+              </w:rPr>
+              <w:t xml:space="preserve">Progress Report</w:t>
+            </w:r>
+          </w:p>
+        </w:tc>
+        <w:tc>
+          <w:tcPr>
+            <w:tcW w:w="2067" w:type="dxa"/>
+            <w:gridSpan w:val="3"/>
+            <w:tcBorders>
+              <w:top w:val="nil"/>
+              <w:left w:val="nil"/>
+              <w:bottom w:val="single" w:sz="5" w:space="0" w:color="C00000"/>
+              <w:right w:val="nil"/>
+            </w:tcBorders>
+            <w:vAlign w:val="center"/>
+          </w:tcPr>
+          <w:p>
+            <w:pPr>
+              <w:spacing w:after="0"/>
+              <w:jc w:val="center"/>
+            </w:pPr>
+            <w:r>
+              <w:rPr>
+                <w:b/>
+                <w:color w:val="C00000"/>
+                <w:sz w:val="14"/>
+                <w:szCs w:val="14"/>
+              </w:rPr>
+              <w:t xml:space="preserve">Term 1</w:t>
+            </w:r>
+          </w:p>
+        </w:tc>
+        <w:tc>
+          <w:tcPr>
+            <w:tcW w:w="2756" w:type="dxa"/>
+            <w:gridSpan w:val="4"/>
+            <w:tcBorders>
+              <w:top w:val="nil"/>
+              <w:left w:val="nil"/>
+              <w:bottom w:val="single" w:sz="5" w:space="0" w:color="C00000"/>
+              <w:right w:val="nil"/>
+            </w:tcBorders>
+            <w:vAlign w:val="center"/>
+          </w:tcPr>
+          <w:p>
+            <w:pPr>
+              <w:spacing w:after="0"/>
+              <w:jc w:val="center"/>
+            </w:pPr>
+            <w:r>
+              <w:rPr>
+                <w:b/>
+                <w:color w:val="C00000"/>
+                <w:sz w:val="14"/>
+                <w:szCs w:val="14"/>
+              </w:rPr>
+              <w:t xml:space="preserve">Term 2</w:t>
             </w:r>
           </w:p>
         </w:tc>
@@ -2585,14 +2394,13 @@
           <w:p>
             <w:pPr>
               <w:spacing w:after="0"/>
-              <w:jc w:val="center"/>
-            </w:pPr>
-            <w:r>
-              <w:rPr>
-                <w:sz w:val="14"/>
-                <w:szCs w:val="14"/>
-              </w:rPr>
-              <w:t xml:space="preserve">Total</w:t>
+            </w:pPr>
+            <w:r>
+              <w:rPr>
+                <w:sz w:val="14"/>
+                <w:szCs w:val="14"/>
+              </w:rPr>
+              <w:t xml:space="preserve"/>
             </w:r>
           </w:p>
         </w:tc>
@@ -2616,14 +2424,13 @@
           <w:p>
             <w:pPr>
               <w:spacing w:after="0"/>
-              <w:jc w:val="left"/>
-            </w:pPr>
-            <w:r>
-              <w:rPr>
-                <w:sz w:val="14"/>
-                <w:szCs w:val="14"/>
-              </w:rPr>
-              <w:t xml:space="preserve">Days of School</w:t>
+            </w:pPr>
+            <w:r>
+              <w:rPr>
+                <w:sz w:val="14"/>
+                <w:szCs w:val="14"/>
+              </w:rPr>
+              <w:t xml:space="preserve"/>
             </w:r>
           </w:p>
         </w:tc>
@@ -2648,7 +2455,7 @@
                 <w:sz w:val="14"/>
                 <w:szCs w:val="14"/>
               </w:rPr>
-              <w:t xml:space="preserve">{{job_categories.homeroom_deportment.job_template_phases.s1.job_template_tasks.m07.task_outcomes.school_days.numeric_value}}</w:t>
+              <w:t xml:space="preserve">July</w:t>
             </w:r>
           </w:p>
         </w:tc>
@@ -2673,7 +2480,7 @@
                 <w:sz w:val="14"/>
                 <w:szCs w:val="14"/>
               </w:rPr>
-              <w:t xml:space="preserve">{{job_categories.homeroom_deportment.job_template_phases.s1.job_template_tasks.m08.task_outcomes.school_days.numeric_value}}</w:t>
+              <w:t xml:space="preserve">August</w:t>
             </w:r>
           </w:p>
         </w:tc>
@@ -2698,7 +2505,7 @@
                 <w:sz w:val="14"/>
                 <w:szCs w:val="14"/>
               </w:rPr>
-              <w:t xml:space="preserve">{{job_categories.homeroom_deportment.job_template_phases.s1.job_template_tasks.m09.task_outcomes.school_days.numeric_value}}</w:t>
+              <w:t xml:space="preserve">September</w:t>
             </w:r>
           </w:p>
         </w:tc>
@@ -2723,7 +2530,7 @@
                 <w:sz w:val="14"/>
                 <w:szCs w:val="14"/>
               </w:rPr>
-              <w:t xml:space="preserve">{{job_categories.homeroom_deportment.job_template_phases.s1.job_template_tasks.m10.task_outcomes.school_days.numeric_value}}</w:t>
+              <w:t xml:space="preserve">October</w:t>
             </w:r>
           </w:p>
         </w:tc>
@@ -2748,7 +2555,7 @@
                 <w:sz w:val="14"/>
                 <w:szCs w:val="14"/>
               </w:rPr>
-              <w:t xml:space="preserve">{{job_categories.homeroom_deportment.job_template_phases.s1.job_template_tasks.m11.task_outcomes.school_days.numeric_value}}</w:t>
+              <w:t xml:space="preserve">October</w:t>
             </w:r>
           </w:p>
         </w:tc>
@@ -2773,7 +2580,7 @@
                 <w:sz w:val="14"/>
                 <w:szCs w:val="14"/>
               </w:rPr>
-              <w:t xml:space="preserve">{{job_categories.homeroom_deportment.job_template_phases.s1.job_template_tasks.m12.task_outcomes.school_days.numeric_value}}</w:t>
+              <w:t xml:space="preserve">November</w:t>
             </w:r>
           </w:p>
         </w:tc>
@@ -2798,7 +2605,7 @@
                 <w:sz w:val="14"/>
                 <w:szCs w:val="14"/>
               </w:rPr>
-              <w:t xml:space="preserve">{{job_categories.homeroom_deportment.job_template_phases.s2.job_template_tasks.m01.task_outcomes.school_days.numeric_value}}</w:t>
+              <w:t xml:space="preserve">December</w:t>
             </w:r>
           </w:p>
         </w:tc>
@@ -2823,7 +2630,7 @@
                 <w:sz w:val="14"/>
                 <w:szCs w:val="14"/>
               </w:rPr>
-              <w:t xml:space="preserve">{{job_categories.homeroom_deportment.job_template_phases.s2.job_template_tasks.m02.task_outcomes.school_days.numeric_value}}</w:t>
+              <w:t xml:space="preserve">January</w:t>
             </w:r>
           </w:p>
         </w:tc>
@@ -2848,7 +2655,7 @@
                 <w:sz w:val="14"/>
                 <w:szCs w:val="14"/>
               </w:rPr>
-              <w:t xml:space="preserve">{{job_categories.homeroom_deportment.job_template_phases.s2.job_template_tasks.m03.task_outcomes.school_days.numeric_value}}</w:t>
+              <w:t xml:space="preserve">February</w:t>
             </w:r>
           </w:p>
         </w:tc>
@@ -2873,7 +2680,7 @@
                 <w:sz w:val="14"/>
                 <w:szCs w:val="14"/>
               </w:rPr>
-              <w:t xml:space="preserve">{{job_categories.homeroom_deportment.job_template_phases.s2.job_template_tasks.m04.task_outcomes.school_days.numeric_value}}</w:t>
+              <w:t xml:space="preserve">March</w:t>
             </w:r>
           </w:p>
         </w:tc>
@@ -2898,7 +2705,7 @@
                 <w:sz w:val="14"/>
                 <w:szCs w:val="14"/>
               </w:rPr>
-              <w:t xml:space="preserve">{{job_categories.homeroom_deportment.job_template_phases.s2.job_template_tasks.m05.task_outcomes.school_days.numeric_value}}</w:t>
+              <w:t xml:space="preserve">April</w:t>
             </w:r>
           </w:p>
         </w:tc>
@@ -2923,7 +2730,7 @@
                 <w:sz w:val="14"/>
                 <w:szCs w:val="14"/>
               </w:rPr>
-              <w:t xml:space="preserve">{{job_categories.homeroom_deportment.task_outcomes.school_days.numeric_value_total_derived}}</w:t>
+              <w:t xml:space="preserve">Total</w:t>
             </w:r>
           </w:p>
         </w:tc>
@@ -2954,7 +2761,7 @@
                 <w:sz w:val="14"/>
                 <w:szCs w:val="14"/>
               </w:rPr>
-              <w:t xml:space="preserve">Days Present</w:t>
+              <w:t xml:space="preserve">Days of School</w:t>
             </w:r>
           </w:p>
         </w:tc>
@@ -2979,7 +2786,7 @@
                 <w:sz w:val="14"/>
                 <w:szCs w:val="14"/>
               </w:rPr>
-              <w:t xml:space="preserve">{{job_categories.homeroom_deportment.job_template_phases.s1.job_template_tasks.m07.task_outcomes.days_present.numeric_value}}</w:t>
+              <w:t xml:space="preserve">{{job_categories.homeroom_attendance.job_template_phases.progress_report.job_template_tasks.m07.task_outcomes.school_days.numeric_value}}</w:t>
             </w:r>
           </w:p>
         </w:tc>
@@ -3004,7 +2811,7 @@
                 <w:sz w:val="14"/>
                 <w:szCs w:val="14"/>
               </w:rPr>
-              <w:t xml:space="preserve">{{job_categories.homeroom_deportment.job_template_phases.s1.job_template_tasks.m08.task_outcomes.days_present.numeric_value}}</w:t>
+              <w:t xml:space="preserve">{{job_categories.homeroom_attendance.job_template_phases.progress_report.job_template_tasks.m08.task_outcomes.school_days.numeric_value}}</w:t>
             </w:r>
           </w:p>
         </w:tc>
@@ -3029,7 +2836,7 @@
                 <w:sz w:val="14"/>
                 <w:szCs w:val="14"/>
               </w:rPr>
-              <w:t xml:space="preserve">{{job_categories.homeroom_deportment.job_template_phases.s1.job_template_tasks.m09.task_outcomes.days_present.numeric_value}}</w:t>
+              <w:t xml:space="preserve">{{job_categories.homeroom_attendance.job_template_phases.progress_report.job_template_tasks.m09.task_outcomes.school_days.numeric_value}}</w:t>
             </w:r>
           </w:p>
         </w:tc>
@@ -3054,7 +2861,7 @@
                 <w:sz w:val="14"/>
                 <w:szCs w:val="14"/>
               </w:rPr>
-              <w:t xml:space="preserve">{{job_categories.homeroom_deportment.job_template_phases.s1.job_template_tasks.m10.task_outcomes.days_present.numeric_value}}</w:t>
+              <w:t xml:space="preserve">{{job_categories.homeroom_attendance.job_template_phases.progress_report.job_template_tasks.m10.task_outcomes.school_days.numeric_value}}</w:t>
             </w:r>
           </w:p>
         </w:tc>
@@ -3079,7 +2886,7 @@
                 <w:sz w:val="14"/>
                 <w:szCs w:val="14"/>
               </w:rPr>
-              <w:t xml:space="preserve">{{job_categories.homeroom_deportment.job_template_phases.s1.job_template_tasks.m11.task_outcomes.days_present.numeric_value}}</w:t>
+              <w:t xml:space="preserve">{{job_categories.homeroom_attendance.job_template_phases.s1.job_template_tasks.m10.task_outcomes.school_days.numeric_value}}</w:t>
             </w:r>
           </w:p>
         </w:tc>
@@ -3104,7 +2911,7 @@
                 <w:sz w:val="14"/>
                 <w:szCs w:val="14"/>
               </w:rPr>
-              <w:t xml:space="preserve">{{job_categories.homeroom_deportment.job_template_phases.s1.job_template_tasks.m12.task_outcomes.days_present.numeric_value}}</w:t>
+              <w:t xml:space="preserve">{{job_categories.homeroom_attendance.job_template_phases.s1.job_template_tasks.m11.task_outcomes.school_days.numeric_value}}</w:t>
             </w:r>
           </w:p>
         </w:tc>
@@ -3129,7 +2936,7 @@
                 <w:sz w:val="14"/>
                 <w:szCs w:val="14"/>
               </w:rPr>
-              <w:t xml:space="preserve">{{job_categories.homeroom_deportment.job_template_phases.s2.job_template_tasks.m01.task_outcomes.days_present.numeric_value}}</w:t>
+              <w:t xml:space="preserve">{{job_categories.homeroom_attendance.job_template_phases.s1.job_template_tasks.m12.task_outcomes.school_days.numeric_value}}</w:t>
             </w:r>
           </w:p>
         </w:tc>
@@ -3154,7 +2961,7 @@
                 <w:sz w:val="14"/>
                 <w:szCs w:val="14"/>
               </w:rPr>
-              <w:t xml:space="preserve">{{job_categories.homeroom_deportment.job_template_phases.s2.job_template_tasks.m02.task_outcomes.days_present.numeric_value}}</w:t>
+              <w:t xml:space="preserve">{{job_categories.homeroom_attendance.job_template_phases.s2.job_template_tasks.m01.task_outcomes.school_days.numeric_value}}</w:t>
             </w:r>
           </w:p>
         </w:tc>
@@ -3179,7 +2986,7 @@
                 <w:sz w:val="14"/>
                 <w:szCs w:val="14"/>
               </w:rPr>
-              <w:t xml:space="preserve">{{job_categories.homeroom_deportment.job_template_phases.s2.job_template_tasks.m03.task_outcomes.days_present.numeric_value}}</w:t>
+              <w:t xml:space="preserve">{{job_categories.homeroom_attendance.job_template_phases.s2.job_template_tasks.m02.task_outcomes.school_days.numeric_value}}</w:t>
             </w:r>
           </w:p>
         </w:tc>
@@ -3204,7 +3011,7 @@
                 <w:sz w:val="14"/>
                 <w:szCs w:val="14"/>
               </w:rPr>
-              <w:t xml:space="preserve">{{job_categories.homeroom_deportment.job_template_phases.s2.job_template_tasks.m04.task_outcomes.days_present.numeric_value}}</w:t>
+              <w:t xml:space="preserve">{{job_categories.homeroom_attendance.job_template_phases.s2.job_template_tasks.m03.task_outcomes.school_days.numeric_value}}</w:t>
             </w:r>
           </w:p>
         </w:tc>
@@ -3229,7 +3036,7 @@
                 <w:sz w:val="14"/>
                 <w:szCs w:val="14"/>
               </w:rPr>
-              <w:t xml:space="preserve">{{job_categories.homeroom_deportment.job_template_phases.s2.job_template_tasks.m05.task_outcomes.days_present.numeric_value}}</w:t>
+              <w:t xml:space="preserve">{{job_categories.homeroom_attendance.job_template_phases.s2.job_template_tasks.m04.task_outcomes.school_days.numeric_value}}</w:t>
             </w:r>
           </w:p>
         </w:tc>
@@ -3254,7 +3061,7 @@
                 <w:sz w:val="14"/>
                 <w:szCs w:val="14"/>
               </w:rPr>
-              <w:t xml:space="preserve">{{job_categories.homeroom_deportment.task_outcomes.days_present.numeric_value_total_derived}}</w:t>
+              <w:t xml:space="preserve">{{job_categories.homeroom_attendance.task_outcomes.school_days.numeric_value_total_derived}}</w:t>
             </w:r>
           </w:p>
         </w:tc>
@@ -3285,6 +3092,337 @@
                 <w:sz w:val="14"/>
                 <w:szCs w:val="14"/>
               </w:rPr>
+              <w:t xml:space="preserve">Days Present</w:t>
+            </w:r>
+          </w:p>
+        </w:tc>
+        <w:tc>
+          <w:tcPr>
+            <w:tcW w:w="689" w:type="dxa"/>
+            <w:tcBorders>
+              <w:top w:val="nil"/>
+              <w:left w:val="nil"/>
+              <w:bottom w:val="single" w:sz="5" w:space="0" w:color="C00000"/>
+              <w:right w:val="nil"/>
+            </w:tcBorders>
+            <w:vAlign w:val="center"/>
+          </w:tcPr>
+          <w:p>
+            <w:pPr>
+              <w:spacing w:after="0"/>
+              <w:jc w:val="center"/>
+            </w:pPr>
+            <w:r>
+              <w:rPr>
+                <w:sz w:val="14"/>
+                <w:szCs w:val="14"/>
+              </w:rPr>
+              <w:t xml:space="preserve">{{job_categories.homeroom_attendance.job_template_phases.progress_report.job_template_tasks.m07.task_outcomes.days_present.numeric_value}}</w:t>
+            </w:r>
+          </w:p>
+        </w:tc>
+        <w:tc>
+          <w:tcPr>
+            <w:tcW w:w="689" w:type="dxa"/>
+            <w:tcBorders>
+              <w:top w:val="nil"/>
+              <w:left w:val="nil"/>
+              <w:bottom w:val="single" w:sz="5" w:space="0" w:color="C00000"/>
+              <w:right w:val="nil"/>
+            </w:tcBorders>
+            <w:vAlign w:val="center"/>
+          </w:tcPr>
+          <w:p>
+            <w:pPr>
+              <w:spacing w:after="0"/>
+              <w:jc w:val="center"/>
+            </w:pPr>
+            <w:r>
+              <w:rPr>
+                <w:sz w:val="14"/>
+                <w:szCs w:val="14"/>
+              </w:rPr>
+              <w:t xml:space="preserve">{{job_categories.homeroom_attendance.job_template_phases.progress_report.job_template_tasks.m08.task_outcomes.days_present.numeric_value}}</w:t>
+            </w:r>
+          </w:p>
+        </w:tc>
+        <w:tc>
+          <w:tcPr>
+            <w:tcW w:w="779" w:type="dxa"/>
+            <w:tcBorders>
+              <w:top w:val="nil"/>
+              <w:left w:val="nil"/>
+              <w:bottom w:val="single" w:sz="5" w:space="0" w:color="C00000"/>
+              <w:right w:val="nil"/>
+            </w:tcBorders>
+            <w:vAlign w:val="center"/>
+          </w:tcPr>
+          <w:p>
+            <w:pPr>
+              <w:spacing w:after="0"/>
+              <w:jc w:val="center"/>
+            </w:pPr>
+            <w:r>
+              <w:rPr>
+                <w:sz w:val="14"/>
+                <w:szCs w:val="14"/>
+              </w:rPr>
+              <w:t xml:space="preserve">{{job_categories.homeroom_attendance.job_template_phases.progress_report.job_template_tasks.m09.task_outcomes.days_present.numeric_value}}</w:t>
+            </w:r>
+          </w:p>
+        </w:tc>
+        <w:tc>
+          <w:tcPr>
+            <w:tcW w:w="689" w:type="dxa"/>
+            <w:tcBorders>
+              <w:top w:val="nil"/>
+              <w:left w:val="nil"/>
+              <w:bottom w:val="single" w:sz="5" w:space="0" w:color="C00000"/>
+              <w:right w:val="nil"/>
+            </w:tcBorders>
+            <w:vAlign w:val="center"/>
+          </w:tcPr>
+          <w:p>
+            <w:pPr>
+              <w:spacing w:after="0"/>
+              <w:jc w:val="center"/>
+            </w:pPr>
+            <w:r>
+              <w:rPr>
+                <w:sz w:val="14"/>
+                <w:szCs w:val="14"/>
+              </w:rPr>
+              <w:t xml:space="preserve">{{job_categories.homeroom_attendance.job_template_phases.progress_report.job_template_tasks.m10.task_outcomes.days_present.numeric_value}}</w:t>
+            </w:r>
+          </w:p>
+        </w:tc>
+        <w:tc>
+          <w:tcPr>
+            <w:tcW w:w="689" w:type="dxa"/>
+            <w:tcBorders>
+              <w:top w:val="nil"/>
+              <w:left w:val="nil"/>
+              <w:bottom w:val="single" w:sz="5" w:space="0" w:color="C00000"/>
+              <w:right w:val="nil"/>
+            </w:tcBorders>
+            <w:vAlign w:val="center"/>
+          </w:tcPr>
+          <w:p>
+            <w:pPr>
+              <w:spacing w:after="0"/>
+              <w:jc w:val="center"/>
+            </w:pPr>
+            <w:r>
+              <w:rPr>
+                <w:sz w:val="14"/>
+                <w:szCs w:val="14"/>
+              </w:rPr>
+              <w:t xml:space="preserve">{{job_categories.homeroom_attendance.job_template_phases.s1.job_template_tasks.m10.task_outcomes.days_present.numeric_value}}</w:t>
+            </w:r>
+          </w:p>
+        </w:tc>
+        <w:tc>
+          <w:tcPr>
+            <w:tcW w:w="689" w:type="dxa"/>
+            <w:tcBorders>
+              <w:top w:val="nil"/>
+              <w:left w:val="nil"/>
+              <w:bottom w:val="single" w:sz="5" w:space="0" w:color="C00000"/>
+              <w:right w:val="nil"/>
+            </w:tcBorders>
+            <w:vAlign w:val="center"/>
+          </w:tcPr>
+          <w:p>
+            <w:pPr>
+              <w:spacing w:after="0"/>
+              <w:jc w:val="center"/>
+            </w:pPr>
+            <w:r>
+              <w:rPr>
+                <w:sz w:val="14"/>
+                <w:szCs w:val="14"/>
+              </w:rPr>
+              <w:t xml:space="preserve">{{job_categories.homeroom_attendance.job_template_phases.s1.job_template_tasks.m11.task_outcomes.days_present.numeric_value}}</w:t>
+            </w:r>
+          </w:p>
+        </w:tc>
+        <w:tc>
+          <w:tcPr>
+            <w:tcW w:w="689" w:type="dxa"/>
+            <w:tcBorders>
+              <w:top w:val="nil"/>
+              <w:left w:val="nil"/>
+              <w:bottom w:val="single" w:sz="5" w:space="0" w:color="C00000"/>
+              <w:right w:val="nil"/>
+            </w:tcBorders>
+            <w:vAlign w:val="center"/>
+          </w:tcPr>
+          <w:p>
+            <w:pPr>
+              <w:spacing w:after="0"/>
+              <w:jc w:val="center"/>
+            </w:pPr>
+            <w:r>
+              <w:rPr>
+                <w:sz w:val="14"/>
+                <w:szCs w:val="14"/>
+              </w:rPr>
+              <w:t xml:space="preserve">{{job_categories.homeroom_attendance.job_template_phases.s1.job_template_tasks.m12.task_outcomes.days_present.numeric_value}}</w:t>
+            </w:r>
+          </w:p>
+        </w:tc>
+        <w:tc>
+          <w:tcPr>
+            <w:tcW w:w="689" w:type="dxa"/>
+            <w:tcBorders>
+              <w:top w:val="nil"/>
+              <w:left w:val="nil"/>
+              <w:bottom w:val="single" w:sz="5" w:space="0" w:color="C00000"/>
+              <w:right w:val="nil"/>
+            </w:tcBorders>
+            <w:vAlign w:val="center"/>
+          </w:tcPr>
+          <w:p>
+            <w:pPr>
+              <w:spacing w:after="0"/>
+              <w:jc w:val="center"/>
+            </w:pPr>
+            <w:r>
+              <w:rPr>
+                <w:sz w:val="14"/>
+                <w:szCs w:val="14"/>
+              </w:rPr>
+              <w:t xml:space="preserve">{{job_categories.homeroom_attendance.job_template_phases.s2.job_template_tasks.m01.task_outcomes.days_present.numeric_value}}</w:t>
+            </w:r>
+          </w:p>
+        </w:tc>
+        <w:tc>
+          <w:tcPr>
+            <w:tcW w:w="689" w:type="dxa"/>
+            <w:tcBorders>
+              <w:top w:val="nil"/>
+              <w:left w:val="nil"/>
+              <w:bottom w:val="single" w:sz="5" w:space="0" w:color="C00000"/>
+              <w:right w:val="nil"/>
+            </w:tcBorders>
+            <w:vAlign w:val="center"/>
+          </w:tcPr>
+          <w:p>
+            <w:pPr>
+              <w:spacing w:after="0"/>
+              <w:jc w:val="center"/>
+            </w:pPr>
+            <w:r>
+              <w:rPr>
+                <w:sz w:val="14"/>
+                <w:szCs w:val="14"/>
+              </w:rPr>
+              <w:t xml:space="preserve">{{job_categories.homeroom_attendance.job_template_phases.s2.job_template_tasks.m02.task_outcomes.days_present.numeric_value}}</w:t>
+            </w:r>
+          </w:p>
+        </w:tc>
+        <w:tc>
+          <w:tcPr>
+            <w:tcW w:w="689" w:type="dxa"/>
+            <w:tcBorders>
+              <w:top w:val="nil"/>
+              <w:left w:val="nil"/>
+              <w:bottom w:val="single" w:sz="5" w:space="0" w:color="C00000"/>
+              <w:right w:val="nil"/>
+            </w:tcBorders>
+            <w:vAlign w:val="center"/>
+          </w:tcPr>
+          <w:p>
+            <w:pPr>
+              <w:spacing w:after="0"/>
+              <w:jc w:val="center"/>
+            </w:pPr>
+            <w:r>
+              <w:rPr>
+                <w:sz w:val="14"/>
+                <w:szCs w:val="14"/>
+              </w:rPr>
+              <w:t xml:space="preserve">{{job_categories.homeroom_attendance.job_template_phases.s2.job_template_tasks.m03.task_outcomes.days_present.numeric_value}}</w:t>
+            </w:r>
+          </w:p>
+        </w:tc>
+        <w:tc>
+          <w:tcPr>
+            <w:tcW w:w="689" w:type="dxa"/>
+            <w:tcBorders>
+              <w:top w:val="nil"/>
+              <w:left w:val="nil"/>
+              <w:bottom w:val="single" w:sz="5" w:space="0" w:color="C00000"/>
+              <w:right w:val="nil"/>
+            </w:tcBorders>
+            <w:vAlign w:val="center"/>
+          </w:tcPr>
+          <w:p>
+            <w:pPr>
+              <w:spacing w:after="0"/>
+              <w:jc w:val="center"/>
+            </w:pPr>
+            <w:r>
+              <w:rPr>
+                <w:sz w:val="14"/>
+                <w:szCs w:val="14"/>
+              </w:rPr>
+              <w:t xml:space="preserve">{{job_categories.homeroom_attendance.job_template_phases.s2.job_template_tasks.m04.task_outcomes.days_present.numeric_value}}</w:t>
+            </w:r>
+          </w:p>
+        </w:tc>
+        <w:tc>
+          <w:tcPr>
+            <w:tcW w:w="692" w:type="dxa"/>
+            <w:tcBorders>
+              <w:top w:val="nil"/>
+              <w:left w:val="nil"/>
+              <w:bottom w:val="single" w:sz="5" w:space="0" w:color="C00000"/>
+              <w:right w:val="nil"/>
+            </w:tcBorders>
+            <w:vAlign w:val="center"/>
+          </w:tcPr>
+          <w:p>
+            <w:pPr>
+              <w:spacing w:after="0"/>
+              <w:jc w:val="center"/>
+            </w:pPr>
+            <w:r>
+              <w:rPr>
+                <w:sz w:val="14"/>
+                <w:szCs w:val="14"/>
+              </w:rPr>
+              <w:t xml:space="preserve">{{job_categories.homeroom_attendance.task_outcomes.days_present.numeric_value_total_derived}}</w:t>
+            </w:r>
+          </w:p>
+        </w:tc>
+      </w:tr>
+      <w:tr>
+        <w:trPr>
+          <w:cantSplit/>
+          <w:trHeight w:val="284" w:hRule="atLeast"/>
+        </w:trPr>
+        <w:tc>
+          <w:tcPr>
+            <w:tcW w:w="1611" w:type="dxa"/>
+            <w:tcBorders>
+              <w:top w:val="nil"/>
+              <w:left w:val="nil"/>
+              <w:bottom w:val="single" w:sz="5" w:space="0" w:color="C00000"/>
+              <w:right w:val="nil"/>
+            </w:tcBorders>
+            <w:vAlign w:val="center"/>
+          </w:tcPr>
+          <w:p>
+            <w:pPr>
+              <w:spacing w:after="0"/>
+              <w:jc w:val="left"/>
+            </w:pPr>
+            <w:r>
+              <w:rPr>
+                <w:sz w:val="14"/>
+                <w:szCs w:val="14"/>
+              </w:rPr>
               <w:t xml:space="preserve">Times Tardy</w:t>
             </w:r>
           </w:p>
@@ -3310,7 +3448,7 @@
                 <w:sz w:val="14"/>
                 <w:szCs w:val="14"/>
               </w:rPr>
-              <w:t xml:space="preserve">{{job_categories.homeroom_deportment.job_template_phases.s1.job_template_tasks.m07.task_outcomes.times_tardy.numeric_value}}</w:t>
+              <w:t xml:space="preserve">{{job_categories.homeroom_attendance.job_template_phases.progress_report.job_template_tasks.m07.task_outcomes.times_tardy.numeric_value}}</w:t>
             </w:r>
           </w:p>
         </w:tc>
@@ -3335,7 +3473,7 @@
                 <w:sz w:val="14"/>
                 <w:szCs w:val="14"/>
               </w:rPr>
-              <w:t xml:space="preserve">{{job_categories.homeroom_deportment.job_template_phases.s1.job_template_tasks.m08.task_outcomes.times_tardy.numeric_value}}</w:t>
+              <w:t xml:space="preserve">{{job_categories.homeroom_attendance.job_template_phases.progress_report.job_template_tasks.m08.task_outcomes.times_tardy.numeric_value}}</w:t>
             </w:r>
           </w:p>
         </w:tc>
@@ -3360,7 +3498,7 @@
                 <w:sz w:val="14"/>
                 <w:szCs w:val="14"/>
               </w:rPr>
-              <w:t xml:space="preserve">{{job_categories.homeroom_deportment.job_template_phases.s1.job_template_tasks.m09.task_outcomes.times_tardy.numeric_value}}</w:t>
+              <w:t xml:space="preserve">{{job_categories.homeroom_attendance.job_template_phases.progress_report.job_template_tasks.m09.task_outcomes.times_tardy.numeric_value}}</w:t>
             </w:r>
           </w:p>
         </w:tc>
@@ -3385,7 +3523,7 @@
                 <w:sz w:val="14"/>
                 <w:szCs w:val="14"/>
               </w:rPr>
-              <w:t xml:space="preserve">{{job_categories.homeroom_deportment.job_template_phases.s1.job_template_tasks.m10.task_outcomes.times_tardy.numeric_value}}</w:t>
+              <w:t xml:space="preserve">{{job_categories.homeroom_attendance.job_template_phases.progress_report.job_template_tasks.m10.task_outcomes.times_tardy.numeric_value}}</w:t>
             </w:r>
           </w:p>
         </w:tc>
@@ -3410,7 +3548,7 @@
                 <w:sz w:val="14"/>
                 <w:szCs w:val="14"/>
               </w:rPr>
-              <w:t xml:space="preserve">{{job_categories.homeroom_deportment.job_template_phases.s1.job_template_tasks.m11.task_outcomes.times_tardy.numeric_value}}</w:t>
+              <w:t xml:space="preserve">{{job_categories.homeroom_attendance.job_template_phases.s1.job_template_tasks.m10.task_outcomes.times_tardy.numeric_value}}</w:t>
             </w:r>
           </w:p>
         </w:tc>
@@ -3435,7 +3573,7 @@
                 <w:sz w:val="14"/>
                 <w:szCs w:val="14"/>
               </w:rPr>
-              <w:t xml:space="preserve">{{job_categories.homeroom_deportment.job_template_phases.s1.job_template_tasks.m12.task_outcomes.times_tardy.numeric_value}}</w:t>
+              <w:t xml:space="preserve">{{job_categories.homeroom_attendance.job_template_phases.s1.job_template_tasks.m11.task_outcomes.times_tardy.numeric_value}}</w:t>
             </w:r>
           </w:p>
         </w:tc>
@@ -3460,7 +3598,7 @@
                 <w:sz w:val="14"/>
                 <w:szCs w:val="14"/>
               </w:rPr>
-              <w:t xml:space="preserve">{{job_categories.homeroom_deportment.job_template_phases.s2.job_template_tasks.m01.task_outcomes.times_tardy.numeric_value}}</w:t>
+              <w:t xml:space="preserve">{{job_categories.homeroom_attendance.job_template_phases.s1.job_template_tasks.m12.task_outcomes.times_tardy.numeric_value}}</w:t>
             </w:r>
           </w:p>
         </w:tc>
@@ -3485,7 +3623,7 @@
                 <w:sz w:val="14"/>
                 <w:szCs w:val="14"/>
               </w:rPr>
-              <w:t xml:space="preserve">{{job_categories.homeroom_deportment.job_template_phases.s2.job_template_tasks.m02.task_outcomes.times_tardy.numeric_value}}</w:t>
+              <w:t xml:space="preserve">{{job_categories.homeroom_attendance.job_template_phases.s2.job_template_tasks.m01.task_outcomes.times_tardy.numeric_value}}</w:t>
             </w:r>
           </w:p>
         </w:tc>
@@ -3510,7 +3648,7 @@
                 <w:sz w:val="14"/>
                 <w:szCs w:val="14"/>
               </w:rPr>
-              <w:t xml:space="preserve">{{job_categories.homeroom_deportment.job_template_phases.s2.job_template_tasks.m03.task_outcomes.times_tardy.numeric_value}}</w:t>
+              <w:t xml:space="preserve">{{job_categories.homeroom_attendance.job_template_phases.s2.job_template_tasks.m02.task_outcomes.times_tardy.numeric_value}}</w:t>
             </w:r>
           </w:p>
         </w:tc>
@@ -3535,7 +3673,7 @@
                 <w:sz w:val="14"/>
                 <w:szCs w:val="14"/>
               </w:rPr>
-              <w:t xml:space="preserve">{{job_categories.homeroom_deportment.job_template_phases.s2.job_template_tasks.m04.task_outcomes.times_tardy.numeric_value}}</w:t>
+              <w:t xml:space="preserve">{{job_categories.homeroom_attendance.job_template_phases.s2.job_template_tasks.m03.task_outcomes.times_tardy.numeric_value}}</w:t>
             </w:r>
           </w:p>
         </w:tc>
@@ -3560,7 +3698,7 @@
                 <w:sz w:val="14"/>
                 <w:szCs w:val="14"/>
               </w:rPr>
-              <w:t xml:space="preserve">{{job_categories.homeroom_deportment.job_template_phases.s2.job_template_tasks.m05.task_outcomes.times_tardy.numeric_value}}</w:t>
+              <w:t xml:space="preserve">{{job_categories.homeroom_attendance.job_template_phases.s2.job_template_tasks.m04.task_outcomes.times_tardy.numeric_value}}</w:t>
             </w:r>
           </w:p>
         </w:tc>
@@ -3585,7 +3723,7 @@
                 <w:sz w:val="14"/>
                 <w:szCs w:val="14"/>
               </w:rPr>
-              <w:t xml:space="preserve">{{job_categories.homeroom_deportment.task_outcomes.times_tardy.numeric_value_total_derived}}</w:t>
+              <w:t xml:space="preserve">{{job_categories.homeroom_attendance.task_outcomes.times_tardy.numeric_value_total_derived}}</w:t>
             </w:r>
           </w:p>
         </w:tc>

</xml_diff>